<commit_message>
Capitulo 0.1 updated with the title of the project
</commit_message>
<xml_diff>
--- a/docs/Capítulo 0.1 - Portada.docx
+++ b/docs/Capítulo 0.1 - Portada.docx
@@ -269,7 +269,25 @@
           <w:sz w:val="44"/>
           <w:szCs w:val="44"/>
         </w:rPr>
-        <w:t>"TÍTULO DEL TRABAJO FIN DE GRADO REALIZADO POR EL ALUMNO"</w:t>
+        <w:t>"</w:t>
+      </w:r>
+      <w:r>
+        <w:rPr>
+          <w:rFonts w:ascii="Times New Roman" w:eastAsia="Times New Roman" w:hAnsi="Times New Roman" w:cs="Times New Roman"/>
+          <w:color w:val="FFCC00"/>
+          <w:sz w:val="44"/>
+          <w:szCs w:val="44"/>
+        </w:rPr>
+        <w:t>CAREPET: APLICACIÓN WEB PARA LA GESTIÓN INTEGRAL DEL CUIDADO DE MASCOTAS</w:t>
+      </w:r>
+      <w:r>
+        <w:rPr>
+          <w:rFonts w:ascii="Times New Roman" w:eastAsia="Times New Roman" w:hAnsi="Times New Roman" w:cs="Times New Roman"/>
+          <w:color w:val="FFCC00"/>
+          <w:sz w:val="44"/>
+          <w:szCs w:val="44"/>
+        </w:rPr>
+        <w:t>"</w:t>
       </w:r>
     </w:p>
     <w:p>
@@ -359,7 +377,25 @@
           <w:sz w:val="28"/>
           <w:szCs w:val="28"/>
         </w:rPr>
-        <w:t>Junio - 20</w:t>
+        <w:t>Mayo</w:t>
+      </w:r>
+      <w:r>
+        <w:rPr>
+          <w:rFonts w:ascii="Times New Roman" w:eastAsia="Times New Roman" w:hAnsi="Times New Roman" w:cs="Times New Roman"/>
+          <w:color w:val="FFCC00"/>
+          <w:sz w:val="28"/>
+          <w:szCs w:val="28"/>
+        </w:rPr>
+        <w:t xml:space="preserve"> - 20</w:t>
+      </w:r>
+      <w:r>
+        <w:rPr>
+          <w:rFonts w:ascii="Times New Roman" w:eastAsia="Times New Roman" w:hAnsi="Times New Roman" w:cs="Times New Roman"/>
+          <w:color w:val="FFCC00"/>
+          <w:sz w:val="28"/>
+          <w:szCs w:val="28"/>
+        </w:rPr>
+        <w:t>26</w:t>
       </w:r>
     </w:p>
     <w:p>
@@ -472,9 +508,8 @@
           <w:sz w:val="28"/>
           <w:szCs w:val="28"/>
         </w:rPr>
-        <w:t xml:space="preserve">DIRECTOR/ES: Nombre Apellido </w:t>
-      </w:r>
-      <w:proofErr w:type="spellStart"/>
+        <w:t xml:space="preserve">DIRECTOR/ES: </w:t>
+      </w:r>
       <w:r>
         <w:rPr>
           <w:rFonts w:ascii="Times New Roman" w:eastAsia="Times New Roman" w:hAnsi="Times New Roman" w:cs="Times New Roman"/>
@@ -482,9 +517,8 @@
           <w:sz w:val="28"/>
           <w:szCs w:val="28"/>
         </w:rPr>
-        <w:t>Apellido</w:t>
-      </w:r>
-      <w:proofErr w:type="spellEnd"/>
+        <w:t xml:space="preserve"> -</w:t>
+      </w:r>
     </w:p>
     <w:p>
       <w:pPr>
@@ -504,26 +538,6 @@
           <w:szCs w:val="28"/>
         </w:rPr>
       </w:pPr>
-      <w:r>
-        <w:rPr>
-          <w:rFonts w:ascii="Times New Roman" w:eastAsia="Times New Roman" w:hAnsi="Times New Roman" w:cs="Times New Roman"/>
-          <w:color w:val="FFCC00"/>
-          <w:sz w:val="28"/>
-          <w:szCs w:val="28"/>
-        </w:rPr>
-        <w:t xml:space="preserve">Nombre Apellido </w:t>
-      </w:r>
-      <w:proofErr w:type="spellStart"/>
-      <w:r>
-        <w:rPr>
-          <w:rFonts w:ascii="Times New Roman" w:eastAsia="Times New Roman" w:hAnsi="Times New Roman" w:cs="Times New Roman"/>
-          <w:color w:val="FFCC00"/>
-          <w:sz w:val="28"/>
-          <w:szCs w:val="28"/>
-        </w:rPr>
-        <w:t>Apellido</w:t>
-      </w:r>
-      <w:proofErr w:type="spellEnd"/>
     </w:p>
     <w:sectPr>
       <w:footerReference w:type="default" r:id="rId7"/>

</xml_diff>